<commit_message>
Correct filter clog rate finding from 10 to 15 years
The underlying MOC evidence (201101076 / 201102090) dates the issue to 2011,
fifteen years against the current date, not ten. Corrected in cv_content.py
(shared by both CV targets) and both cover letter paragraph sets. All CVs
remain three pages, both cover letters one page, in PDF and Word.

Co-Authored-By: Claude Sonnet 5 <noreply@anthropic.com>
Claude-Session: https://claude.ai/code/session_013H3AMzMWzEerJx7AeqeVQp
</commit_message>
<xml_diff>
--- a/AZODO_EMEKA_CV_Machinery_Engineer_ExxonMobil_no_passport.docx
+++ b/AZODO_EMEKA_CV_Machinery_Engineer_ExxonMobil_no_passport.docx
@@ -985,7 +985,7 @@
           <w:color w:val="1A1A1A"/>
           <w:sz w:val="18"/>
         </w:rPr>
-        <w:t>10-year high filter clog rate on the lube-oil system:</w:t>
+        <w:t>15-year high filter clog rate on the lube-oil system:</w:t>
       </w:r>
       <w:r>
         <w:rPr>
@@ -995,7 +995,7 @@
           <w:color w:val="1A1A1A"/>
           <w:sz w:val="18"/>
         </w:rPr>
-        <w:t xml:space="preserve"> identified the problem during a systematic system review, tracing a decade of high differential pressure, rapid filter clogging and element collapse to undocumented as-built versus as-designed discrepancies. Introduced an elemental </w:t>
+        <w:t xml:space="preserve"> identified the problem during a systematic system review, tracing a decade and a half of high differential pressure, rapid filter clogging and element collapse to undocumented as-built versus as-designed discrepancies. Introduced an elemental </w:t>
       </w:r>
       <w:r>
         <w:rPr>

</xml_diff>

<commit_message>
Drop the international-mobilisation line from the ExxonMobil CV header
The Nigeria Deepwater Machinery Engineer post is a Lagos-based local role, so
'available for immediate international mobilisation' doesn't fit it the way
it fits the Qatar posting. BOSIET and OSP stay in the header for both
targets; only the mobilisation clause is now target-conditional. All four
CVs remain three pages, both cover letters one page, in PDF and Word.

Co-Authored-By: Claude Sonnet 5 <noreply@anthropic.com>
Claude-Session: https://claude.ai/code/session_013H3AMzMWzEerJx7AeqeVQp
</commit_message>
<xml_diff>
--- a/AZODO_EMEKA_CV_Machinery_Engineer_ExxonMobil_no_passport.docx
+++ b/AZODO_EMEKA_CV_Machinery_Engineer_ExxonMobil_no_passport.docx
@@ -79,17 +79,7 @@
           <w:color w:val="3F4A54"/>
           <w:sz w:val="17"/>
         </w:rPr>
-        <w:t xml:space="preserve">BOSIET with CA-EBS (valid to 2029)  |  Offshore Safety Permit (OSP)  |  </w:t>
-      </w:r>
-      <w:r>
-        <w:rPr>
-          <w:rFonts w:ascii="Calibri" w:hAnsi="Calibri"/>
-          <w:b/>
-          <w:i w:val="0"/>
-          <w:color w:val="3F4A54"/>
-          <w:sz w:val="17"/>
-        </w:rPr>
-        <w:t>Available for immediate international mobilisation</w:t>
+        <w:t>BOSIET with CA-EBS (valid to 2029)  |  Offshore Safety Permit (OSP)</w:t>
       </w:r>
     </w:p>
     <w:p>

</xml_diff>